<commit_message>
Lien vers le site officiel bearsoft44.fr dans le README et la notice
Co-Authored-By: Claude Opus 5.5 (1M context) <noreply@anthropic.com>
Claude-Session: https://claude.ai/code/session_0119prB8bH5XgK6smybdfM5g
</commit_message>
<xml_diff>
--- a/notice/Mode_emploi_Bombe_V2.1.2.docx
+++ b/notice/Mode_emploi_Bombe_V2.1.2.docx
@@ -8550,7 +8550,28 @@
         <w:sz w:val="16"/>
         <w:szCs w:val="16"/>
       </w:rPr>
-      <w:t xml:space="preserve">La Bombe · Bearsoft 44 · logiciel V2.1.2 · page </w:t>
+      <w:t xml:space="preserve">La Bombe · Bearsoft 44 · </w:t>
+    </w:r>
+    <w:hyperlink r:id="rIdSite">
+      <w:r>
+        <w:rPr>
+          <w:rFonts w:ascii="Arial" w:cs="Arial" w:eastAsia="Arial" w:hAnsi="Arial"/>
+          <w:color w:val="5F6B76"/>
+          <w:sz w:val="16"/>
+          <w:szCs w:val="16"/>
+          <w:u w:val="single"/>
+        </w:rPr>
+        <w:t>bearsoft44.fr</w:t>
+      </w:r>
+    </w:hyperlink>
+    <w:r>
+      <w:rPr>
+        <w:rFonts w:ascii="Arial" w:cs="Arial" w:eastAsia="Arial" w:hAnsi="Arial"/>
+        <w:color w:val="5F6B76"/>
+        <w:sz w:val="16"/>
+        <w:szCs w:val="16"/>
+      </w:rPr>
+      <w:t xml:space="preserve"> · logiciel V2.1.2 · page </w:t>
     </w:r>
     <w:r>
       <w:rPr>

</xml_diff>